<commit_message>
P2: align hidden-work act and instructions with reviewed form
</commit_message>
<xml_diff>
--- a/products-storage/02-dopraboty-bez-poter/04-akt-skrytyh-rabot.docx
+++ b/products-storage/02-dopraboty-bez-poter/04-akt-skrytyh-rabot.docx
@@ -8,12 +8,12 @@
         <w:jc w:val="left"/>
       </w:pPr>
       <w:r>
-        <w:t>Акт освидетельствования скрываемых работ</w:t>
+        <w:t>Акт освидетельствования скрытых работ</w:t>
       </w:r>
     </w:p>
     <w:p>
       <w:r>
-        <w:t>До закрытия участка предъявите выполненный объём участникам, указанным в договоре и документации объекта. Зафиксируйте проверенные границы, материалы, результаты и решение о последующих работах.</w:t>
+        <w:t>Форма для объекта капитального строительства по составу рекомендуемого образца приложения № 3 к приказу Минстроя России № 344/пр. Заполняйте фактические даты, реквизиты и участников перед закрытием работ; лишние для объекта роли отметьте как неприменимые с основанием.</w:t>
       </w:r>
     </w:p>
     <w:p>
@@ -23,7 +23,7 @@
         <w:pageBreakBefore w:val="0"/>
       </w:pPr>
       <w:r>
-        <w:t>Реквизиты</w:t>
+        <w:t>Объект и организации</w:t>
       </w:r>
     </w:p>
     <w:tbl>
@@ -59,7 +59,7 @@
                 <w:color w:val="262F37"/>
                 <w:sz w:val="18"/>
               </w:rPr>
-              <w:t>Документ</w:t>
+              <w:t>Акт</w:t>
             </w:r>
           </w:p>
         </w:tc>
@@ -79,53 +79,7 @@
                 <w:color w:val="262F37"/>
                 <w:sz w:val="18"/>
               </w:rPr>
-              <w:t>Акт № [___] от [___]; место [___]</w:t>
-            </w:r>
-          </w:p>
-        </w:tc>
-      </w:tr>
-      <w:tr>
-        <w:trPr>
-          <w:cantSplit/>
-        </w:trPr>
-        <w:tc>
-          <w:tcPr>
-            <w:tcW w:type="dxa" w:w="2268"/>
-            <w:vAlign w:val="center"/>
-            <w:shd w:fill="F3F0E8"/>
-          </w:tcPr>
-          <w:p>
-            <w:pPr>
-              <w:spacing w:after="0"/>
-            </w:pPr>
-            <w:r/>
-            <w:r>
-              <w:rPr>
-                <w:b/>
-                <w:color w:val="262F37"/>
-                <w:sz w:val="18"/>
-              </w:rPr>
-              <w:t>Договор</w:t>
-            </w:r>
-          </w:p>
-        </w:tc>
-        <w:tc>
-          <w:tcPr>
-            <w:tcW w:type="dxa" w:w="7427"/>
-            <w:vAlign w:val="center"/>
-          </w:tcPr>
-          <w:p>
-            <w:pPr>
-              <w:spacing w:after="0"/>
-            </w:pPr>
-            <w:r/>
-            <w:r>
-              <w:rPr>
-                <w:b w:val="0"/>
-                <w:color w:val="262F37"/>
-                <w:sz w:val="18"/>
-              </w:rPr>
-              <w:t>Договор подряда № [___] от [___]; исходное приложение / смета [___]</w:t>
+              <w:t>№ [___] от [___]; место составления [___]; осмотр [дата, время]</w:t>
             </w:r>
           </w:p>
         </w:tc>
@@ -171,7 +125,7 @@
                 <w:color w:val="262F37"/>
                 <w:sz w:val="18"/>
               </w:rPr>
-              <w:t>Наименование, адрес, участок или захватка [___]</w:t>
+              <w:t>Наименование по проекту, адрес, секция, захватка, оси и отметки [___]</w:t>
             </w:r>
           </w:p>
         </w:tc>
@@ -197,7 +151,7 @@
                 <w:color w:val="262F37"/>
                 <w:sz w:val="18"/>
               </w:rPr>
-              <w:t>Подрядчик</w:t>
+              <w:t>Заказчик / застройщик</w:t>
             </w:r>
           </w:p>
         </w:tc>
@@ -217,7 +171,7 @@
                 <w:color w:val="262F37"/>
                 <w:sz w:val="18"/>
               </w:rPr>
-              <w:t>Полное наименование, ИНН, адрес [___]</w:t>
+              <w:t>Наименование, ОГРН, ИНН, адрес, телефон; при необходимости СРО [___]</w:t>
             </w:r>
           </w:p>
         </w:tc>
@@ -243,7 +197,7 @@
                 <w:color w:val="262F37"/>
                 <w:sz w:val="18"/>
               </w:rPr>
-              <w:t>Заказчик</w:t>
+              <w:t>Строительство</w:t>
             </w:r>
           </w:p>
         </w:tc>
@@ -263,76 +217,7 @@
                 <w:color w:val="262F37"/>
                 <w:sz w:val="18"/>
               </w:rPr>
-              <w:t>Полное наименование, ИНН, адрес [___]</w:t>
-            </w:r>
-          </w:p>
-        </w:tc>
-      </w:tr>
-    </w:tbl>
-    <w:p>
-      <w:pPr>
-        <w:pStyle w:val="Heading1"/>
-        <w:keepNext/>
-        <w:pageBreakBefore w:val="0"/>
-      </w:pPr>
-      <w:r>
-        <w:t>Участники и основание</w:t>
-      </w:r>
-    </w:p>
-    <w:tbl>
-      <w:tblPr>
-        <w:tblStyle w:val="TableGrid"/>
-        <w:tblW w:type="auto" w:w="0"/>
-        <w:jc w:val="center"/>
-        <w:tblLayout w:type="fixed"/>
-        <w:tblLook w:firstColumn="1" w:firstRow="1" w:lastColumn="0" w:lastRow="0" w:noHBand="0" w:noVBand="1" w:val="04A0"/>
-      </w:tblPr>
-      <w:tblGrid>
-        <w:gridCol w:w="2268"/>
-        <w:gridCol w:w="7427"/>
-      </w:tblGrid>
-      <w:tr>
-        <w:trPr>
-          <w:cantSplit/>
-        </w:trPr>
-        <w:tc>
-          <w:tcPr>
-            <w:tcW w:type="dxa" w:w="2268"/>
-            <w:vAlign w:val="center"/>
-            <w:shd w:fill="F3F0E8"/>
-          </w:tcPr>
-          <w:p>
-            <w:pPr>
-              <w:spacing w:after="0"/>
-            </w:pPr>
-            <w:r/>
-            <w:r>
-              <w:rPr>
-                <w:b/>
-                <w:color w:val="262F37"/>
-                <w:sz w:val="18"/>
-              </w:rPr>
-              <w:t>Осмотр</w:t>
-            </w:r>
-          </w:p>
-        </w:tc>
-        <w:tc>
-          <w:tcPr>
-            <w:tcW w:type="dxa" w:w="7427"/>
-            <w:vAlign w:val="center"/>
-          </w:tcPr>
-          <w:p>
-            <w:pPr>
-              <w:spacing w:after="0"/>
-            </w:pPr>
-            <w:r/>
-            <w:r>
-              <w:rPr>
-                <w:b w:val="0"/>
-                <w:color w:val="262F37"/>
-                <w:sz w:val="18"/>
-              </w:rPr>
-              <w:t>Дата, время, место, участок / захватка [___]</w:t>
+              <w:t>Лицо, осуществляющее строительство: наименование, ОГРН, ИНН, адрес, телефон, при необходимости СРО [___]</w:t>
             </w:r>
           </w:p>
         </w:tc>
@@ -358,7 +243,7 @@
                 <w:color w:val="262F37"/>
                 <w:sz w:val="18"/>
               </w:rPr>
-              <w:t>Участники</w:t>
+              <w:t>Проектировщик</w:t>
             </w:r>
           </w:p>
         </w:tc>
@@ -378,7 +263,7 @@
                 <w:color w:val="262F37"/>
                 <w:sz w:val="18"/>
               </w:rPr>
-              <w:t>Организация, должность, Ф. И. О. и полномочия каждого: [___]</w:t>
+              <w:t>Наименование, ОГРН, ИНН, адрес; при необходимости СРО [___]</w:t>
             </w:r>
           </w:p>
         </w:tc>
@@ -404,7 +289,7 @@
                 <w:color w:val="262F37"/>
                 <w:sz w:val="18"/>
               </w:rPr>
-              <w:t>Документация</w:t>
+              <w:t>Исполнитель работ</w:t>
             </w:r>
           </w:p>
         </w:tc>
@@ -424,18 +309,41 @@
                 <w:color w:val="262F37"/>
                 <w:sz w:val="18"/>
               </w:rPr>
-              <w:t>Чертёж, лист, изменение, проект, нормы договора: № и дата [___]</w:t>
+              <w:t>Фактически выполнившая организация, ОГРН, ИНН, договор № [___] от [___]</w:t>
             </w:r>
           </w:p>
         </w:tc>
       </w:tr>
+    </w:tbl>
+    <w:p>
+      <w:pPr>
+        <w:pStyle w:val="Heading1"/>
+        <w:keepNext/>
+        <w:pageBreakBefore w:val="0"/>
+      </w:pPr>
+      <w:r>
+        <w:t>Представители, проводившие осмотр</w:t>
+      </w:r>
+    </w:p>
+    <w:tbl>
+      <w:tblPr>
+        <w:tblStyle w:val="TableGrid"/>
+        <w:tblW w:type="auto" w:w="0"/>
+        <w:tblLayout w:type="fixed"/>
+        <w:tblLook w:firstColumn="1" w:firstRow="1" w:lastColumn="0" w:lastRow="0" w:noHBand="0" w:noVBand="1" w:val="04A0"/>
+      </w:tblPr>
+      <w:tblGrid>
+        <w:gridCol w:w="3289"/>
+        <w:gridCol w:w="3289"/>
+        <w:gridCol w:w="3289"/>
+      </w:tblGrid>
       <w:tr>
         <w:trPr>
           <w:cantSplit/>
         </w:trPr>
         <w:tc>
           <w:tcPr>
-            <w:tcW w:type="dxa" w:w="2268"/>
+            <w:tcW w:type="dxa" w:w="3289"/>
             <w:vAlign w:val="center"/>
             <w:shd w:fill="F3F0E8"/>
           </w:tcPr>
@@ -450,63 +358,13 @@
                 <w:color w:val="262F37"/>
                 <w:sz w:val="18"/>
               </w:rPr>
-              <w:t>Доп. объём</w:t>
+              <w:t>Роль</w:t>
             </w:r>
           </w:p>
         </w:tc>
         <w:tc>
           <w:tcPr>
-            <w:tcW w:type="dxa" w:w="7427"/>
-            <w:vAlign w:val="center"/>
-          </w:tcPr>
-          <w:p>
-            <w:pPr>
-              <w:spacing w:after="0"/>
-            </w:pPr>
-            <w:r/>
-            <w:r>
-              <w:rPr>
-                <w:b w:val="0"/>
-                <w:color w:val="262F37"/>
-                <w:sz w:val="18"/>
-              </w:rPr>
-              <w:t>Форма 02 № [___] от [___]; поручение 01 / уведомление 03 [___]</w:t>
-            </w:r>
-          </w:p>
-        </w:tc>
-      </w:tr>
-    </w:tbl>
-    <w:p>
-      <w:pPr>
-        <w:pStyle w:val="Heading1"/>
-        <w:keepNext/>
-        <w:pageBreakBefore w:val="0"/>
-      </w:pPr>
-      <w:r>
-        <w:t>Освидетельствованные работы</w:t>
-      </w:r>
-    </w:p>
-    <w:tbl>
-      <w:tblPr>
-        <w:tblStyle w:val="TableGrid"/>
-        <w:tblW w:type="auto" w:w="0"/>
-        <w:tblLayout w:type="fixed"/>
-        <w:tblLook w:firstColumn="1" w:firstRow="1" w:lastColumn="0" w:lastRow="0" w:noHBand="0" w:noVBand="1" w:val="04A0"/>
-      </w:tblPr>
-      <w:tblGrid>
-        <w:gridCol w:w="1973"/>
-        <w:gridCol w:w="1973"/>
-        <w:gridCol w:w="1973"/>
-        <w:gridCol w:w="1973"/>
-        <w:gridCol w:w="1973"/>
-      </w:tblGrid>
-      <w:tr>
-        <w:trPr>
-          <w:cantSplit/>
-        </w:trPr>
-        <w:tc>
-          <w:tcPr>
-            <w:tcW w:type="dxa" w:w="1973"/>
+            <w:tcW w:type="dxa" w:w="3289"/>
             <w:vAlign w:val="center"/>
             <w:shd w:fill="F3F0E8"/>
           </w:tcPr>
@@ -521,13 +379,13 @@
                 <w:color w:val="262F37"/>
                 <w:sz w:val="18"/>
               </w:rPr>
-              <w:t>№</w:t>
+              <w:t>Организация, должность и Ф. И. О.</w:t>
             </w:r>
           </w:p>
         </w:tc>
         <w:tc>
           <w:tcPr>
-            <w:tcW w:type="dxa" w:w="1973"/>
+            <w:tcW w:type="dxa" w:w="3289"/>
             <w:vAlign w:val="center"/>
             <w:shd w:fill="F3F0E8"/>
           </w:tcPr>
@@ -542,70 +400,7 @@
                 <w:color w:val="262F37"/>
                 <w:sz w:val="18"/>
               </w:rPr>
-              <w:t>Работа и место</w:t>
-            </w:r>
-          </w:p>
-        </w:tc>
-        <w:tc>
-          <w:tcPr>
-            <w:tcW w:type="dxa" w:w="1973"/>
-            <w:vAlign w:val="center"/>
-            <w:shd w:fill="F3F0E8"/>
-          </w:tcPr>
-          <w:p>
-            <w:pPr>
-              <w:spacing w:after="0"/>
-            </w:pPr>
-            <w:r/>
-            <w:r>
-              <w:rPr>
-                <w:b/>
-                <w:color w:val="262F37"/>
-                <w:sz w:val="18"/>
-              </w:rPr>
-              <w:t>Объём / ед.</w:t>
-            </w:r>
-          </w:p>
-        </w:tc>
-        <w:tc>
-          <w:tcPr>
-            <w:tcW w:type="dxa" w:w="1973"/>
-            <w:vAlign w:val="center"/>
-            <w:shd w:fill="F3F0E8"/>
-          </w:tcPr>
-          <w:p>
-            <w:pPr>
-              <w:spacing w:after="0"/>
-            </w:pPr>
-            <w:r/>
-            <w:r>
-              <w:rPr>
-                <w:b/>
-                <w:color w:val="262F37"/>
-                <w:sz w:val="18"/>
-              </w:rPr>
-              <w:t>Проектный узел</w:t>
-            </w:r>
-          </w:p>
-        </w:tc>
-        <w:tc>
-          <w:tcPr>
-            <w:tcW w:type="dxa" w:w="1973"/>
-            <w:vAlign w:val="center"/>
-            <w:shd w:fill="F3F0E8"/>
-          </w:tcPr>
-          <w:p>
-            <w:pPr>
-              <w:spacing w:after="0"/>
-            </w:pPr>
-            <w:r/>
-            <w:r>
-              <w:rPr>
-                <w:b/>
-                <w:color w:val="262F37"/>
-                <w:sz w:val="18"/>
-              </w:rPr>
-              <w:t>Результат проверки</w:t>
+              <w:t>Полномочия / НРС</w:t>
             </w:r>
           </w:p>
         </w:tc>
@@ -616,7 +411,7 @@
         </w:trPr>
         <w:tc>
           <w:tcPr>
-            <w:tcW w:type="dxa" w:w="1973"/>
+            <w:tcW w:type="dxa" w:w="3289"/>
             <w:vAlign w:val="center"/>
           </w:tcPr>
           <w:p>
@@ -630,13 +425,13 @@
                 <w:color w:val="262F37"/>
                 <w:sz w:val="18"/>
               </w:rPr>
-              <w:t>1</w:t>
+              <w:t>Контроль заказчика</w:t>
             </w:r>
           </w:p>
         </w:tc>
         <w:tc>
           <w:tcPr>
-            <w:tcW w:type="dxa" w:w="1973"/>
+            <w:tcW w:type="dxa" w:w="3289"/>
             <w:vAlign w:val="center"/>
           </w:tcPr>
           <w:p>
@@ -656,47 +451,7 @@
         </w:tc>
         <w:tc>
           <w:tcPr>
-            <w:tcW w:type="dxa" w:w="1973"/>
-            <w:vAlign w:val="center"/>
-          </w:tcPr>
-          <w:p>
-            <w:pPr>
-              <w:spacing w:after="0"/>
-            </w:pPr>
-            <w:r/>
-            <w:r>
-              <w:rPr>
-                <w:b w:val="0"/>
-                <w:color w:val="262F37"/>
-                <w:sz w:val="18"/>
-              </w:rPr>
-              <w:t>[___]</w:t>
-            </w:r>
-          </w:p>
-        </w:tc>
-        <w:tc>
-          <w:tcPr>
-            <w:tcW w:type="dxa" w:w="1973"/>
-            <w:vAlign w:val="center"/>
-          </w:tcPr>
-          <w:p>
-            <w:pPr>
-              <w:spacing w:after="0"/>
-            </w:pPr>
-            <w:r/>
-            <w:r>
-              <w:rPr>
-                <w:b w:val="0"/>
-                <w:color w:val="262F37"/>
-                <w:sz w:val="18"/>
-              </w:rPr>
-              <w:t>[___]</w:t>
-            </w:r>
-          </w:p>
-        </w:tc>
-        <w:tc>
-          <w:tcPr>
-            <w:tcW w:type="dxa" w:w="1973"/>
+            <w:tcW w:type="dxa" w:w="3289"/>
             <w:vAlign w:val="center"/>
           </w:tcPr>
           <w:p>
@@ -721,7 +476,7 @@
         </w:trPr>
         <w:tc>
           <w:tcPr>
-            <w:tcW w:type="dxa" w:w="1973"/>
+            <w:tcW w:type="dxa" w:w="3289"/>
             <w:vAlign w:val="center"/>
           </w:tcPr>
           <w:p>
@@ -735,13 +490,13 @@
                 <w:color w:val="262F37"/>
                 <w:sz w:val="18"/>
               </w:rPr>
-              <w:t>2</w:t>
+              <w:t>Строительство</w:t>
             </w:r>
           </w:p>
         </w:tc>
         <w:tc>
           <w:tcPr>
-            <w:tcW w:type="dxa" w:w="1973"/>
+            <w:tcW w:type="dxa" w:w="3289"/>
             <w:vAlign w:val="center"/>
           </w:tcPr>
           <w:p>
@@ -761,47 +516,7 @@
         </w:tc>
         <w:tc>
           <w:tcPr>
-            <w:tcW w:type="dxa" w:w="1973"/>
-            <w:vAlign w:val="center"/>
-          </w:tcPr>
-          <w:p>
-            <w:pPr>
-              <w:spacing w:after="0"/>
-            </w:pPr>
-            <w:r/>
-            <w:r>
-              <w:rPr>
-                <w:b w:val="0"/>
-                <w:color w:val="262F37"/>
-                <w:sz w:val="18"/>
-              </w:rPr>
-              <w:t>[___]</w:t>
-            </w:r>
-          </w:p>
-        </w:tc>
-        <w:tc>
-          <w:tcPr>
-            <w:tcW w:type="dxa" w:w="1973"/>
-            <w:vAlign w:val="center"/>
-          </w:tcPr>
-          <w:p>
-            <w:pPr>
-              <w:spacing w:after="0"/>
-            </w:pPr>
-            <w:r/>
-            <w:r>
-              <w:rPr>
-                <w:b w:val="0"/>
-                <w:color w:val="262F37"/>
-                <w:sz w:val="18"/>
-              </w:rPr>
-              <w:t>[___]</w:t>
-            </w:r>
-          </w:p>
-        </w:tc>
-        <w:tc>
-          <w:tcPr>
-            <w:tcW w:type="dxa" w:w="1973"/>
+            <w:tcW w:type="dxa" w:w="3289"/>
             <w:vAlign w:val="center"/>
           </w:tcPr>
           <w:p>
@@ -826,7 +541,7 @@
         </w:trPr>
         <w:tc>
           <w:tcPr>
-            <w:tcW w:type="dxa" w:w="1973"/>
+            <w:tcW w:type="dxa" w:w="3289"/>
             <w:vAlign w:val="center"/>
           </w:tcPr>
           <w:p>
@@ -840,13 +555,13 @@
                 <w:color w:val="262F37"/>
                 <w:sz w:val="18"/>
               </w:rPr>
-              <w:t>3</w:t>
+              <w:t>Контроль строительства</w:t>
             </w:r>
           </w:p>
         </w:tc>
         <w:tc>
           <w:tcPr>
-            <w:tcW w:type="dxa" w:w="1973"/>
+            <w:tcW w:type="dxa" w:w="3289"/>
             <w:vAlign w:val="center"/>
           </w:tcPr>
           <w:p>
@@ -866,7 +581,52 @@
         </w:tc>
         <w:tc>
           <w:tcPr>
-            <w:tcW w:type="dxa" w:w="1973"/>
+            <w:tcW w:type="dxa" w:w="3289"/>
+            <w:vAlign w:val="center"/>
+          </w:tcPr>
+          <w:p>
+            <w:pPr>
+              <w:spacing w:after="0"/>
+            </w:pPr>
+            <w:r/>
+            <w:r>
+              <w:rPr>
+                <w:b w:val="0"/>
+                <w:color w:val="262F37"/>
+                <w:sz w:val="18"/>
+              </w:rPr>
+              <w:t>[___]</w:t>
+            </w:r>
+          </w:p>
+        </w:tc>
+      </w:tr>
+      <w:tr>
+        <w:trPr>
+          <w:cantSplit/>
+        </w:trPr>
+        <w:tc>
+          <w:tcPr>
+            <w:tcW w:type="dxa" w:w="3289"/>
+            <w:vAlign w:val="center"/>
+          </w:tcPr>
+          <w:p>
+            <w:pPr>
+              <w:spacing w:after="0"/>
+            </w:pPr>
+            <w:r/>
+            <w:r>
+              <w:rPr>
+                <w:b w:val="0"/>
+                <w:color w:val="262F37"/>
+                <w:sz w:val="18"/>
+              </w:rPr>
+              <w:t>Проектировщик*</w:t>
+            </w:r>
+          </w:p>
+        </w:tc>
+        <w:tc>
+          <w:tcPr>
+            <w:tcW w:type="dxa" w:w="3289"/>
             <w:vAlign w:val="center"/>
           </w:tcPr>
           <w:p>
@@ -886,7 +646,52 @@
         </w:tc>
         <w:tc>
           <w:tcPr>
-            <w:tcW w:type="dxa" w:w="1973"/>
+            <w:tcW w:type="dxa" w:w="3289"/>
+            <w:vAlign w:val="center"/>
+          </w:tcPr>
+          <w:p>
+            <w:pPr>
+              <w:spacing w:after="0"/>
+            </w:pPr>
+            <w:r/>
+            <w:r>
+              <w:rPr>
+                <w:b w:val="0"/>
+                <w:color w:val="262F37"/>
+                <w:sz w:val="18"/>
+              </w:rPr>
+              <w:t>[___]</w:t>
+            </w:r>
+          </w:p>
+        </w:tc>
+      </w:tr>
+      <w:tr>
+        <w:trPr>
+          <w:cantSplit/>
+        </w:trPr>
+        <w:tc>
+          <w:tcPr>
+            <w:tcW w:type="dxa" w:w="3289"/>
+            <w:vAlign w:val="center"/>
+          </w:tcPr>
+          <w:p>
+            <w:pPr>
+              <w:spacing w:after="0"/>
+            </w:pPr>
+            <w:r/>
+            <w:r>
+              <w:rPr>
+                <w:b w:val="0"/>
+                <w:color w:val="262F37"/>
+                <w:sz w:val="18"/>
+              </w:rPr>
+              <w:t>Исполнитель работ*</w:t>
+            </w:r>
+          </w:p>
+        </w:tc>
+        <w:tc>
+          <w:tcPr>
+            <w:tcW w:type="dxa" w:w="3289"/>
             <w:vAlign w:val="center"/>
           </w:tcPr>
           <w:p>
@@ -906,7 +711,7 @@
         </w:tc>
         <w:tc>
           <w:tcPr>
-            <w:tcW w:type="dxa" w:w="1973"/>
+            <w:tcW w:type="dxa" w:w="3289"/>
             <w:vAlign w:val="center"/>
           </w:tcPr>
           <w:p>
@@ -927,26 +732,32 @@
       </w:tr>
     </w:tbl>
     <w:p>
+      <w:r>
+        <w:t>* Укажите представителя проектировщика при привлечении для проверки соответствия проекту, а представителя исполнителя — при выполнении работ иным лицом. Для применимых ролей укажите документ о полномочиях и идентификатор НРС, если он требуется.</w:t>
+      </w:r>
+    </w:p>
+    <w:p>
       <w:pPr>
         <w:pStyle w:val="Heading1"/>
         <w:keepNext/>
         <w:pageBreakBefore w:val="0"/>
       </w:pPr>
       <w:r>
-        <w:t>Подтверждения и решение</w:t>
+        <w:t>1. Предъявленные скрытые работы</w:t>
       </w:r>
     </w:p>
     <w:tbl>
       <w:tblPr>
         <w:tblStyle w:val="TableGrid"/>
         <w:tblW w:type="auto" w:w="0"/>
-        <w:jc w:val="center"/>
         <w:tblLayout w:type="fixed"/>
         <w:tblLook w:firstColumn="1" w:firstRow="1" w:lastColumn="0" w:lastRow="0" w:noHBand="0" w:noVBand="1" w:val="04A0"/>
       </w:tblPr>
       <w:tblGrid>
-        <w:gridCol w:w="2268"/>
-        <w:gridCol w:w="7427"/>
+        <w:gridCol w:w="2466"/>
+        <w:gridCol w:w="2466"/>
+        <w:gridCol w:w="2466"/>
+        <w:gridCol w:w="2466"/>
       </w:tblGrid>
       <w:tr>
         <w:trPr>
@@ -954,7 +765,7 @@
         </w:trPr>
         <w:tc>
           <w:tcPr>
-            <w:tcW w:type="dxa" w:w="2268"/>
+            <w:tcW w:type="dxa" w:w="2466"/>
             <w:vAlign w:val="center"/>
             <w:shd w:fill="F3F0E8"/>
           </w:tcPr>
@@ -969,38 +780,13 @@
                 <w:color w:val="262F37"/>
                 <w:sz w:val="18"/>
               </w:rPr>
-              <w:t>Материалы</w:t>
+              <w:t>№</w:t>
             </w:r>
           </w:p>
         </w:tc>
         <w:tc>
           <w:tcPr>
-            <w:tcW w:type="dxa" w:w="7427"/>
-            <w:vAlign w:val="center"/>
-          </w:tcPr>
-          <w:p>
-            <w:pPr>
-              <w:spacing w:after="0"/>
-            </w:pPr>
-            <w:r/>
-            <w:r>
-              <w:rPr>
-                <w:b w:val="0"/>
-                <w:color w:val="262F37"/>
-                <w:sz w:val="18"/>
-              </w:rPr>
-              <w:t>Партии, паспорта, сертификаты / иные документы качества [___]</w:t>
-            </w:r>
-          </w:p>
-        </w:tc>
-      </w:tr>
-      <w:tr>
-        <w:trPr>
-          <w:cantSplit/>
-        </w:trPr>
-        <w:tc>
-          <w:tcPr>
-            <w:tcW w:type="dxa" w:w="2268"/>
+            <w:tcW w:type="dxa" w:w="2466"/>
             <w:vAlign w:val="center"/>
             <w:shd w:fill="F3F0E8"/>
           </w:tcPr>
@@ -1015,38 +801,13 @@
                 <w:color w:val="262F37"/>
                 <w:sz w:val="18"/>
               </w:rPr>
-              <w:t>Контроль</w:t>
+              <w:t>Наименование, точное место и границы</w:t>
             </w:r>
           </w:p>
         </w:tc>
         <w:tc>
           <w:tcPr>
-            <w:tcW w:type="dxa" w:w="7427"/>
-            <w:vAlign w:val="center"/>
-          </w:tcPr>
-          <w:p>
-            <w:pPr>
-              <w:spacing w:after="0"/>
-            </w:pPr>
-            <w:r/>
-            <w:r>
-              <w:rPr>
-                <w:b w:val="0"/>
-                <w:color w:val="262F37"/>
-                <w:sz w:val="18"/>
-              </w:rPr>
-              <w:t>Обмеры, испытания, исполнительная схема, запись журнала 08: № / дата [___]</w:t>
-            </w:r>
-          </w:p>
-        </w:tc>
-      </w:tr>
-      <w:tr>
-        <w:trPr>
-          <w:cantSplit/>
-        </w:trPr>
-        <w:tc>
-          <w:tcPr>
-            <w:tcW w:type="dxa" w:w="2268"/>
+            <w:tcW w:type="dxa" w:w="2466"/>
             <w:vAlign w:val="center"/>
             <w:shd w:fill="F3F0E8"/>
           </w:tcPr>
@@ -1061,38 +822,13 @@
                 <w:color w:val="262F37"/>
                 <w:sz w:val="18"/>
               </w:rPr>
-              <w:t>Фото</w:t>
+              <w:t>Объём / ед.</w:t>
             </w:r>
           </w:p>
         </w:tc>
         <w:tc>
           <w:tcPr>
-            <w:tcW w:type="dxa" w:w="7427"/>
-            <w:vAlign w:val="center"/>
-          </w:tcPr>
-          <w:p>
-            <w:pPr>
-              <w:spacing w:after="0"/>
-            </w:pPr>
-            <w:r/>
-            <w:r>
-              <w:rPr>
-                <w:b w:val="0"/>
-                <w:color w:val="262F37"/>
-                <w:sz w:val="18"/>
-              </w:rPr>
-              <w:t>Перечень файлов, дата, место хранения [___]</w:t>
-            </w:r>
-          </w:p>
-        </w:tc>
-      </w:tr>
-      <w:tr>
-        <w:trPr>
-          <w:cantSplit/>
-        </w:trPr>
-        <w:tc>
-          <w:tcPr>
-            <w:tcW w:type="dxa" w:w="2268"/>
+            <w:tcW w:type="dxa" w:w="2466"/>
             <w:vAlign w:val="center"/>
             <w:shd w:fill="F3F0E8"/>
           </w:tcPr>
@@ -1107,13 +843,18 @@
                 <w:color w:val="262F37"/>
                 <w:sz w:val="18"/>
               </w:rPr>
-              <w:t>Замечания</w:t>
+              <w:t>Связь с доп. объёмом</w:t>
             </w:r>
           </w:p>
         </w:tc>
+      </w:tr>
+      <w:tr>
+        <w:trPr>
+          <w:cantSplit/>
+        </w:trPr>
         <w:tc>
           <w:tcPr>
-            <w:tcW w:type="dxa" w:w="7427"/>
+            <w:tcW w:type="dxa" w:w="2466"/>
             <w:vAlign w:val="center"/>
           </w:tcPr>
           <w:p>
@@ -1127,7 +868,67 @@
                 <w:color w:val="262F37"/>
                 <w:sz w:val="18"/>
               </w:rPr>
-              <w:t>Перечень, ответственный, срок устранения или отметка «нет» [___]</w:t>
+              <w:t>1</w:t>
+            </w:r>
+          </w:p>
+        </w:tc>
+        <w:tc>
+          <w:tcPr>
+            <w:tcW w:type="dxa" w:w="2466"/>
+            <w:vAlign w:val="center"/>
+          </w:tcPr>
+          <w:p>
+            <w:pPr>
+              <w:spacing w:after="0"/>
+            </w:pPr>
+            <w:r/>
+            <w:r>
+              <w:rPr>
+                <w:b w:val="0"/>
+                <w:color w:val="262F37"/>
+                <w:sz w:val="18"/>
+              </w:rPr>
+              <w:t>[___]</w:t>
+            </w:r>
+          </w:p>
+        </w:tc>
+        <w:tc>
+          <w:tcPr>
+            <w:tcW w:type="dxa" w:w="2466"/>
+            <w:vAlign w:val="center"/>
+          </w:tcPr>
+          <w:p>
+            <w:pPr>
+              <w:spacing w:after="0"/>
+            </w:pPr>
+            <w:r/>
+            <w:r>
+              <w:rPr>
+                <w:b w:val="0"/>
+                <w:color w:val="262F37"/>
+                <w:sz w:val="18"/>
+              </w:rPr>
+              <w:t>[___]</w:t>
+            </w:r>
+          </w:p>
+        </w:tc>
+        <w:tc>
+          <w:tcPr>
+            <w:tcW w:type="dxa" w:w="2466"/>
+            <w:vAlign w:val="center"/>
+          </w:tcPr>
+          <w:p>
+            <w:pPr>
+              <w:spacing w:after="0"/>
+            </w:pPr>
+            <w:r/>
+            <w:r>
+              <w:rPr>
+                <w:b w:val="0"/>
+                <w:color w:val="262F37"/>
+                <w:sz w:val="18"/>
+              </w:rPr>
+              <w:t>Форма 02 № [___]; позиция [___]</w:t>
             </w:r>
           </w:p>
         </w:tc>
@@ -1138,7 +939,300 @@
         </w:trPr>
         <w:tc>
           <w:tcPr>
-            <w:tcW w:type="dxa" w:w="2268"/>
+            <w:tcW w:type="dxa" w:w="2466"/>
+            <w:vAlign w:val="center"/>
+          </w:tcPr>
+          <w:p>
+            <w:pPr>
+              <w:spacing w:after="0"/>
+            </w:pPr>
+            <w:r/>
+            <w:r>
+              <w:rPr>
+                <w:b w:val="0"/>
+                <w:color w:val="262F37"/>
+                <w:sz w:val="18"/>
+              </w:rPr>
+              <w:t>2</w:t>
+            </w:r>
+          </w:p>
+        </w:tc>
+        <w:tc>
+          <w:tcPr>
+            <w:tcW w:type="dxa" w:w="2466"/>
+            <w:vAlign w:val="center"/>
+          </w:tcPr>
+          <w:p>
+            <w:pPr>
+              <w:spacing w:after="0"/>
+            </w:pPr>
+            <w:r/>
+            <w:r>
+              <w:rPr>
+                <w:b w:val="0"/>
+                <w:color w:val="262F37"/>
+                <w:sz w:val="18"/>
+              </w:rPr>
+              <w:t>[___]</w:t>
+            </w:r>
+          </w:p>
+        </w:tc>
+        <w:tc>
+          <w:tcPr>
+            <w:tcW w:type="dxa" w:w="2466"/>
+            <w:vAlign w:val="center"/>
+          </w:tcPr>
+          <w:p>
+            <w:pPr>
+              <w:spacing w:after="0"/>
+            </w:pPr>
+            <w:r/>
+            <w:r>
+              <w:rPr>
+                <w:b w:val="0"/>
+                <w:color w:val="262F37"/>
+                <w:sz w:val="18"/>
+              </w:rPr>
+              <w:t>[___]</w:t>
+            </w:r>
+          </w:p>
+        </w:tc>
+        <w:tc>
+          <w:tcPr>
+            <w:tcW w:type="dxa" w:w="2466"/>
+            <w:vAlign w:val="center"/>
+          </w:tcPr>
+          <w:p>
+            <w:pPr>
+              <w:spacing w:after="0"/>
+            </w:pPr>
+            <w:r/>
+            <w:r>
+              <w:rPr>
+                <w:b w:val="0"/>
+                <w:color w:val="262F37"/>
+                <w:sz w:val="18"/>
+              </w:rPr>
+              <w:t>Форма 02 № [___]; позиция [___]</w:t>
+            </w:r>
+          </w:p>
+        </w:tc>
+      </w:tr>
+      <w:tr>
+        <w:trPr>
+          <w:cantSplit/>
+        </w:trPr>
+        <w:tc>
+          <w:tcPr>
+            <w:tcW w:type="dxa" w:w="2466"/>
+            <w:vAlign w:val="center"/>
+          </w:tcPr>
+          <w:p>
+            <w:pPr>
+              <w:spacing w:after="0"/>
+            </w:pPr>
+            <w:r/>
+            <w:r>
+              <w:rPr>
+                <w:b w:val="0"/>
+                <w:color w:val="262F37"/>
+                <w:sz w:val="18"/>
+              </w:rPr>
+              <w:t>3</w:t>
+            </w:r>
+          </w:p>
+        </w:tc>
+        <w:tc>
+          <w:tcPr>
+            <w:tcW w:type="dxa" w:w="2466"/>
+            <w:vAlign w:val="center"/>
+          </w:tcPr>
+          <w:p>
+            <w:pPr>
+              <w:spacing w:after="0"/>
+            </w:pPr>
+            <w:r/>
+            <w:r>
+              <w:rPr>
+                <w:b w:val="0"/>
+                <w:color w:val="262F37"/>
+                <w:sz w:val="18"/>
+              </w:rPr>
+              <w:t>[___]</w:t>
+            </w:r>
+          </w:p>
+        </w:tc>
+        <w:tc>
+          <w:tcPr>
+            <w:tcW w:type="dxa" w:w="2466"/>
+            <w:vAlign w:val="center"/>
+          </w:tcPr>
+          <w:p>
+            <w:pPr>
+              <w:spacing w:after="0"/>
+            </w:pPr>
+            <w:r/>
+            <w:r>
+              <w:rPr>
+                <w:b w:val="0"/>
+                <w:color w:val="262F37"/>
+                <w:sz w:val="18"/>
+              </w:rPr>
+              <w:t>[___]</w:t>
+            </w:r>
+          </w:p>
+        </w:tc>
+        <w:tc>
+          <w:tcPr>
+            <w:tcW w:type="dxa" w:w="2466"/>
+            <w:vAlign w:val="center"/>
+          </w:tcPr>
+          <w:p>
+            <w:pPr>
+              <w:spacing w:after="0"/>
+            </w:pPr>
+            <w:r/>
+            <w:r>
+              <w:rPr>
+                <w:b w:val="0"/>
+                <w:color w:val="262F37"/>
+                <w:sz w:val="18"/>
+              </w:rPr>
+              <w:t>Форма 02 № [___]; позиция [___]</w:t>
+            </w:r>
+          </w:p>
+        </w:tc>
+      </w:tr>
+    </w:tbl>
+    <w:p>
+      <w:pPr>
+        <w:pStyle w:val="Heading1"/>
+        <w:keepNext/>
+        <w:pageBreakBefore w:val="0"/>
+      </w:pPr>
+      <w:r>
+        <w:t>2. Проектная и рабочая документация</w:t>
+      </w:r>
+    </w:p>
+    <w:p>
+      <w:r>
+        <w:t>Чертёж / лист / узел, ревизия, проектный раздел, дата, сведения о подготовившем разделе лице: [___]. Изменения документации, по которым выполнялись работы: [___].</w:t>
+      </w:r>
+    </w:p>
+    <w:p>
+      <w:r>
+        <w:br w:type="page"/>
+      </w:r>
+    </w:p>
+    <w:p>
+      <w:pPr>
+        <w:pStyle w:val="Heading1"/>
+        <w:keepNext/>
+        <w:pageBreakBefore w:val="0"/>
+      </w:pPr>
+      <w:r>
+        <w:t>3. Применённые материалы и изделия</w:t>
+      </w:r>
+    </w:p>
+    <w:p>
+      <w:r>
+        <w:t>Наименование, марка, партия, количество, реквизиты документов о качестве и безопасности: [___]. При перечне более пяти документов — реестр № [___] от [___] как приложение.</w:t>
+      </w:r>
+    </w:p>
+    <w:p>
+      <w:pPr>
+        <w:pStyle w:val="Heading1"/>
+        <w:keepNext/>
+        <w:pageBreakBefore w:val="0"/>
+      </w:pPr>
+      <w:r>
+        <w:t>4. Документы о соответствии работ</w:t>
+      </w:r>
+    </w:p>
+    <w:p>
+      <w:r>
+        <w:t>Исполнительные схемы и чертежи, обмеры, акты, результаты обследований, лабораторных и иных испытаний: наименование, номер, дата и результат [___]; реестр приложений № [___].</w:t>
+      </w:r>
+    </w:p>
+    <w:p>
+      <w:pPr>
+        <w:pStyle w:val="Heading1"/>
+        <w:keepNext/>
+        <w:pageBreakBefore w:val="0"/>
+      </w:pPr>
+      <w:r>
+        <w:t>5. Период выполнения</w:t>
+      </w:r>
+    </w:p>
+    <w:p>
+      <w:r>
+        <w:t>Фактическое начало [___]; фактическое окончание [___]. Записи журнала 08 № [___] от [___]; фотофиксация по перечню 09 [___].</w:t>
+      </w:r>
+    </w:p>
+    <w:p>
+      <w:pPr>
+        <w:pStyle w:val="Heading1"/>
+        <w:keepNext/>
+        <w:pageBreakBefore w:val="0"/>
+      </w:pPr>
+      <w:r>
+        <w:t>6. Требования, которым соответствуют работы</w:t>
+      </w:r>
+    </w:p>
+    <w:p>
+      <w:r>
+        <w:t>Технический регламент, иной применимый акт с пунктами, раздел проекта / рабочей документации и критерий проверки: [___]. Результат освидетельствования, замечания и их устранение: [___].</w:t>
+      </w:r>
+    </w:p>
+    <w:p>
+      <w:pPr>
+        <w:pStyle w:val="Heading1"/>
+        <w:keepNext/>
+        <w:pageBreakBefore w:val="0"/>
+      </w:pPr>
+      <w:r>
+        <w:t>7. Решение о последующих работах</w:t>
+      </w:r>
+    </w:p>
+    <w:p>
+      <w:r>
+        <w:t>□ Разрешаются последующие работы: точное наименование, конструкции или участки сетей [___]. □ Не разрешаются: причина и перечень замечаний [___]. Повторное освидетельствование, если требуется: [___].</w:t>
+      </w:r>
+    </w:p>
+    <w:p>
+      <w:r>
+        <w:t>Дополнительные сведения [___]. Приложения с номерами и датами [___]. Акт на бумаге составлен в [___] экземплярах. Цена и срок дополнительных работ оформляются документами 11 и 12.</w:t>
+      </w:r>
+    </w:p>
+    <w:p>
+      <w:pPr>
+        <w:pStyle w:val="Heading1"/>
+        <w:keepNext/>
+        <w:pageBreakBefore w:val="0"/>
+      </w:pPr>
+      <w:r>
+        <w:t>Подписи представителей</w:t>
+      </w:r>
+    </w:p>
+    <w:tbl>
+      <w:tblPr>
+        <w:tblStyle w:val="TableGrid"/>
+        <w:tblW w:type="auto" w:w="0"/>
+        <w:tblLayout w:type="fixed"/>
+        <w:tblLook w:firstColumn="1" w:firstRow="1" w:lastColumn="0" w:lastRow="0" w:noHBand="0" w:noVBand="1" w:val="04A0"/>
+      </w:tblPr>
+      <w:tblGrid>
+        <w:gridCol w:w="3289"/>
+        <w:gridCol w:w="3289"/>
+        <w:gridCol w:w="3289"/>
+      </w:tblGrid>
+      <w:tr>
+        <w:trPr>
+          <w:cantSplit/>
+        </w:trPr>
+        <w:tc>
+          <w:tcPr>
+            <w:tcW w:type="dxa" w:w="3289"/>
             <w:vAlign w:val="center"/>
             <w:shd w:fill="F3F0E8"/>
           </w:tcPr>
@@ -1153,64 +1247,13 @@
                 <w:color w:val="262F37"/>
                 <w:sz w:val="18"/>
               </w:rPr>
-              <w:t>Решение</w:t>
+              <w:t>Роль</w:t>
             </w:r>
           </w:p>
         </w:tc>
         <w:tc>
           <w:tcPr>
-            <w:tcW w:type="dxa" w:w="7427"/>
-            <w:vAlign w:val="center"/>
-          </w:tcPr>
-          <w:p>
-            <w:pPr>
-              <w:spacing w:after="0"/>
-            </w:pPr>
-            <w:r/>
-            <w:r>
-              <w:rPr>
-                <w:b w:val="0"/>
-                <w:color w:val="262F37"/>
-                <w:sz w:val="18"/>
-              </w:rPr>
-              <w:t>□ Разрешены последующие работы по позициям № [___]  □ Не разрешены, причина [___]</w:t>
-            </w:r>
-          </w:p>
-        </w:tc>
-      </w:tr>
-    </w:tbl>
-    <w:p>
-      <w:r>
-        <w:t>Оформите состав участников и экземпляры в соответствии с документацией и применяемой на объекте формой. Этот акт фиксирует осмотр; изменение цены и срока записывается в документах 11 и 12.</w:t>
-      </w:r>
-    </w:p>
-    <w:p>
-      <w:pPr>
-        <w:pStyle w:val="Heading1"/>
-        <w:keepNext/>
-        <w:pageBreakBefore w:val="0"/>
-      </w:pPr>
-      <w:r>
-        <w:t>Подписи сторон</w:t>
-      </w:r>
-    </w:p>
-    <w:tbl>
-      <w:tblPr>
-        <w:tblStyle w:val="TableGrid"/>
-        <w:tblW w:type="auto" w:w="0"/>
-        <w:tblLook w:firstColumn="1" w:firstRow="1" w:lastColumn="0" w:lastRow="0" w:noHBand="0" w:noVBand="1" w:val="04A0"/>
-      </w:tblPr>
-      <w:tblGrid>
-        <w:gridCol w:w="4933"/>
-        <w:gridCol w:w="4933"/>
-      </w:tblGrid>
-      <w:tr>
-        <w:trPr>
-          <w:cantSplit/>
-        </w:trPr>
-        <w:tc>
-          <w:tcPr>
-            <w:tcW w:type="dxa" w:w="4933"/>
+            <w:tcW w:type="dxa" w:w="3289"/>
             <w:vAlign w:val="center"/>
             <w:shd w:fill="F3F0E8"/>
           </w:tcPr>
@@ -1225,13 +1268,13 @@
                 <w:color w:val="262F37"/>
                 <w:sz w:val="18"/>
               </w:rPr>
-              <w:t>Подрядчик</w:t>
+              <w:t>Ф. И. О.</w:t>
             </w:r>
           </w:p>
         </w:tc>
         <w:tc>
           <w:tcPr>
-            <w:tcW w:type="dxa" w:w="4933"/>
+            <w:tcW w:type="dxa" w:w="3289"/>
             <w:vAlign w:val="center"/>
             <w:shd w:fill="F3F0E8"/>
           </w:tcPr>
@@ -1246,7 +1289,7 @@
                 <w:color w:val="262F37"/>
                 <w:sz w:val="18"/>
               </w:rPr>
-              <w:t>Заказчик</w:t>
+              <w:t>Подпись / дата</w:t>
             </w:r>
           </w:p>
         </w:tc>
@@ -1257,7 +1300,7 @@
         </w:trPr>
         <w:tc>
           <w:tcPr>
-            <w:tcW w:type="dxa" w:w="4933"/>
+            <w:tcW w:type="dxa" w:w="3289"/>
             <w:vAlign w:val="center"/>
           </w:tcPr>
           <w:p>
@@ -1271,13 +1314,13 @@
                 <w:color w:val="262F37"/>
                 <w:sz w:val="18"/>
               </w:rPr>
-              <w:t>Должность, Ф. И. О. [___]</w:t>
+              <w:t>Контроль заказчика</w:t>
             </w:r>
           </w:p>
         </w:tc>
         <w:tc>
           <w:tcPr>
-            <w:tcW w:type="dxa" w:w="4933"/>
+            <w:tcW w:type="dxa" w:w="3289"/>
             <w:vAlign w:val="center"/>
           </w:tcPr>
           <w:p>
@@ -1291,18 +1334,13 @@
                 <w:color w:val="262F37"/>
                 <w:sz w:val="18"/>
               </w:rPr>
-              <w:t>Должность, Ф. И. О. [___]</w:t>
+              <w:t>[___]</w:t>
             </w:r>
           </w:p>
         </w:tc>
-      </w:tr>
-      <w:tr>
-        <w:trPr>
-          <w:cantSplit/>
-        </w:trPr>
         <w:tc>
           <w:tcPr>
-            <w:tcW w:type="dxa" w:w="4933"/>
+            <w:tcW w:type="dxa" w:w="3289"/>
             <w:vAlign w:val="center"/>
           </w:tcPr>
           <w:p>
@@ -1316,13 +1354,18 @@
                 <w:color w:val="262F37"/>
                 <w:sz w:val="18"/>
               </w:rPr>
-              <w:t>Основание полномочий [___]</w:t>
+              <w:t>[___]</w:t>
             </w:r>
           </w:p>
         </w:tc>
+      </w:tr>
+      <w:tr>
+        <w:trPr>
+          <w:cantSplit/>
+        </w:trPr>
         <w:tc>
           <w:tcPr>
-            <w:tcW w:type="dxa" w:w="4933"/>
+            <w:tcW w:type="dxa" w:w="3289"/>
             <w:vAlign w:val="center"/>
           </w:tcPr>
           <w:p>
@@ -1336,18 +1379,13 @@
                 <w:color w:val="262F37"/>
                 <w:sz w:val="18"/>
               </w:rPr>
-              <w:t>Основание полномочий [___]</w:t>
+              <w:t>Строительство</w:t>
             </w:r>
           </w:p>
         </w:tc>
-      </w:tr>
-      <w:tr>
-        <w:trPr>
-          <w:cantSplit/>
-        </w:trPr>
         <w:tc>
           <w:tcPr>
-            <w:tcW w:type="dxa" w:w="4933"/>
+            <w:tcW w:type="dxa" w:w="3289"/>
             <w:vAlign w:val="center"/>
           </w:tcPr>
           <w:p>
@@ -1361,13 +1399,13 @@
                 <w:color w:val="262F37"/>
                 <w:sz w:val="18"/>
               </w:rPr>
-              <w:t>Подпись [___]  Дата [___]</w:t>
+              <w:t>[___]</w:t>
             </w:r>
           </w:p>
         </w:tc>
         <w:tc>
           <w:tcPr>
-            <w:tcW w:type="dxa" w:w="4933"/>
+            <w:tcW w:type="dxa" w:w="3289"/>
             <w:vAlign w:val="center"/>
           </w:tcPr>
           <w:p>
@@ -1381,7 +1419,202 @@
                 <w:color w:val="262F37"/>
                 <w:sz w:val="18"/>
               </w:rPr>
-              <w:t>Подпись [___]  Дата [___]</w:t>
+              <w:t>[___]</w:t>
+            </w:r>
+          </w:p>
+        </w:tc>
+      </w:tr>
+      <w:tr>
+        <w:trPr>
+          <w:cantSplit/>
+        </w:trPr>
+        <w:tc>
+          <w:tcPr>
+            <w:tcW w:type="dxa" w:w="3289"/>
+            <w:vAlign w:val="center"/>
+          </w:tcPr>
+          <w:p>
+            <w:pPr>
+              <w:spacing w:after="0"/>
+            </w:pPr>
+            <w:r/>
+            <w:r>
+              <w:rPr>
+                <w:b w:val="0"/>
+                <w:color w:val="262F37"/>
+                <w:sz w:val="18"/>
+              </w:rPr>
+              <w:t>Контроль строительства</w:t>
+            </w:r>
+          </w:p>
+        </w:tc>
+        <w:tc>
+          <w:tcPr>
+            <w:tcW w:type="dxa" w:w="3289"/>
+            <w:vAlign w:val="center"/>
+          </w:tcPr>
+          <w:p>
+            <w:pPr>
+              <w:spacing w:after="0"/>
+            </w:pPr>
+            <w:r/>
+            <w:r>
+              <w:rPr>
+                <w:b w:val="0"/>
+                <w:color w:val="262F37"/>
+                <w:sz w:val="18"/>
+              </w:rPr>
+              <w:t>[___]</w:t>
+            </w:r>
+          </w:p>
+        </w:tc>
+        <w:tc>
+          <w:tcPr>
+            <w:tcW w:type="dxa" w:w="3289"/>
+            <w:vAlign w:val="center"/>
+          </w:tcPr>
+          <w:p>
+            <w:pPr>
+              <w:spacing w:after="0"/>
+            </w:pPr>
+            <w:r/>
+            <w:r>
+              <w:rPr>
+                <w:b w:val="0"/>
+                <w:color w:val="262F37"/>
+                <w:sz w:val="18"/>
+              </w:rPr>
+              <w:t>[___]</w:t>
+            </w:r>
+          </w:p>
+        </w:tc>
+      </w:tr>
+      <w:tr>
+        <w:trPr>
+          <w:cantSplit/>
+        </w:trPr>
+        <w:tc>
+          <w:tcPr>
+            <w:tcW w:type="dxa" w:w="3289"/>
+            <w:vAlign w:val="center"/>
+          </w:tcPr>
+          <w:p>
+            <w:pPr>
+              <w:spacing w:after="0"/>
+            </w:pPr>
+            <w:r/>
+            <w:r>
+              <w:rPr>
+                <w:b w:val="0"/>
+                <w:color w:val="262F37"/>
+                <w:sz w:val="18"/>
+              </w:rPr>
+              <w:t>Проектировщик, если привлечён</w:t>
+            </w:r>
+          </w:p>
+        </w:tc>
+        <w:tc>
+          <w:tcPr>
+            <w:tcW w:type="dxa" w:w="3289"/>
+            <w:vAlign w:val="center"/>
+          </w:tcPr>
+          <w:p>
+            <w:pPr>
+              <w:spacing w:after="0"/>
+            </w:pPr>
+            <w:r/>
+            <w:r>
+              <w:rPr>
+                <w:b w:val="0"/>
+                <w:color w:val="262F37"/>
+                <w:sz w:val="18"/>
+              </w:rPr>
+              <w:t>[___]</w:t>
+            </w:r>
+          </w:p>
+        </w:tc>
+        <w:tc>
+          <w:tcPr>
+            <w:tcW w:type="dxa" w:w="3289"/>
+            <w:vAlign w:val="center"/>
+          </w:tcPr>
+          <w:p>
+            <w:pPr>
+              <w:spacing w:after="0"/>
+            </w:pPr>
+            <w:r/>
+            <w:r>
+              <w:rPr>
+                <w:b w:val="0"/>
+                <w:color w:val="262F37"/>
+                <w:sz w:val="18"/>
+              </w:rPr>
+              <w:t>[___]</w:t>
+            </w:r>
+          </w:p>
+        </w:tc>
+      </w:tr>
+      <w:tr>
+        <w:trPr>
+          <w:cantSplit/>
+        </w:trPr>
+        <w:tc>
+          <w:tcPr>
+            <w:tcW w:type="dxa" w:w="3289"/>
+            <w:vAlign w:val="center"/>
+          </w:tcPr>
+          <w:p>
+            <w:pPr>
+              <w:spacing w:after="0"/>
+            </w:pPr>
+            <w:r/>
+            <w:r>
+              <w:rPr>
+                <w:b w:val="0"/>
+                <w:color w:val="262F37"/>
+                <w:sz w:val="18"/>
+              </w:rPr>
+              <w:t>Исполнитель работ, если иное лицо</w:t>
+            </w:r>
+          </w:p>
+        </w:tc>
+        <w:tc>
+          <w:tcPr>
+            <w:tcW w:type="dxa" w:w="3289"/>
+            <w:vAlign w:val="center"/>
+          </w:tcPr>
+          <w:p>
+            <w:pPr>
+              <w:spacing w:after="0"/>
+            </w:pPr>
+            <w:r/>
+            <w:r>
+              <w:rPr>
+                <w:b w:val="0"/>
+                <w:color w:val="262F37"/>
+                <w:sz w:val="18"/>
+              </w:rPr>
+              <w:t>[___]</w:t>
+            </w:r>
+          </w:p>
+        </w:tc>
+        <w:tc>
+          <w:tcPr>
+            <w:tcW w:type="dxa" w:w="3289"/>
+            <w:vAlign w:val="center"/>
+          </w:tcPr>
+          <w:p>
+            <w:pPr>
+              <w:spacing w:after="0"/>
+            </w:pPr>
+            <w:r/>
+            <w:r>
+              <w:rPr>
+                <w:b w:val="0"/>
+                <w:color w:val="262F37"/>
+                <w:sz w:val="18"/>
+              </w:rPr>
+              <w:t>[___]</w:t>
             </w:r>
           </w:p>
         </w:tc>

</xml_diff>

<commit_message>
Align P2 hidden-works act with Appendix 3 and record 369/pr scope
</commit_message>
<xml_diff>
--- a/products-storage/02-dopraboty-bez-poter/04-akt-skrytyh-rabot.docx
+++ b/products-storage/02-dopraboty-bez-poter/04-akt-skrytyh-rabot.docx
@@ -13,7 +13,7 @@
     </w:p>
     <w:p>
       <w:r>
-        <w:t>Форма для объекта капитального строительства по составу рекомендуемого образца приложения № 3 к приказу Минстроя России № 344/пр. Заполняйте фактические даты, реквизиты и участников перед закрытием работ; участие проектировщика и отдельного исполнителя отметьте по фактическим условиям работ.</w:t>
+        <w:t>Форма для объекта капитального строительства по рекомендуемому образцу приложения № 3 к составу исполнительной документации, утверждённому приказом Минстроя России от 16.05.2023 № 344/пр. Заполняйте фактические даты и участников перед закрытием работ.</w:t>
       </w:r>
     </w:p>
     <w:p>
@@ -151,7 +151,7 @@
                 <w:color w:val="262F37"/>
                 <w:sz w:val="18"/>
               </w:rPr>
-              <w:t>Заказчик / застройщик / технический заказчик</w:t>
+              <w:t>Застройщик / технический заказчик / иное лицо*</w:t>
             </w:r>
           </w:p>
         </w:tc>
@@ -289,7 +289,7 @@
                 <w:color w:val="262F37"/>
                 <w:sz w:val="18"/>
               </w:rPr>
-              <w:t>Строительный контроль</w:t>
+              <w:t>Контроль по договору*</w:t>
             </w:r>
           </w:p>
         </w:tc>
@@ -309,7 +309,7 @@
                 <w:color w:val="262F37"/>
                 <w:sz w:val="18"/>
               </w:rPr>
-              <w:t>Организация по договору, ОГРН, ИНН, адрес, телефон [___]</w:t>
+              <w:t>Если привлечён застройщиком или техническим заказчиком: организация / ИП, ОГРН / ОГРНИП, ИНН, адрес, телефон [___]</w:t>
             </w:r>
           </w:p>
         </w:tc>
@@ -361,6 +361,11 @@
         </w:tc>
       </w:tr>
     </w:tbl>
+    <w:p>
+      <w:r>
+        <w:t>* По фактической роли укажите также лицо, ответственное за эксплуатацию, или регионального оператора. Для ИП: Ф. И. О., ОГРНИП, ИНН и адрес места жительства; для застройщика — физического лица: Ф. И. О., паспортные данные, адрес и телефон.</w:t>
+      </w:r>
+    </w:p>
     <w:p>
       <w:pPr>
         <w:pStyle w:val="Heading1"/>
@@ -471,7 +476,7 @@
                 <w:color w:val="262F37"/>
                 <w:sz w:val="18"/>
               </w:rPr>
-              <w:t>Контроль заказчика</w:t>
+              <w:t>Контроль застройщика / техзаказчика</w:t>
             </w:r>
           </w:p>
         </w:tc>
@@ -536,7 +541,7 @@
                 <w:color w:val="262F37"/>
                 <w:sz w:val="18"/>
               </w:rPr>
-              <w:t>Строительство</w:t>
+              <w:t>Лицо, осуществляющее строительство</w:t>
             </w:r>
           </w:p>
         </w:tc>
@@ -601,7 +606,7 @@
                 <w:color w:val="262F37"/>
                 <w:sz w:val="18"/>
               </w:rPr>
-              <w:t>Контроль строительства</w:t>
+              <w:t>Контроль лица, осуществляющего строительство</w:t>
             </w:r>
           </w:p>
         </w:tc>
@@ -779,7 +784,7 @@
     </w:tbl>
     <w:p>
       <w:r>
-        <w:t>* Укажите представителя проектировщика при привлечении для проверки соответствия проекту, а представителя исполнителя — при выполнении работ иным лицом. Для применимых ролей укажите документ о полномочиях и идентификатор НРС, если он требуется.</w:t>
+        <w:t>Представителя проектировщика укажите при привлечении для проверки соответствия проекту, представителя исполнителя — при выполнении работ иным лицом. Для всех представителей укажите распорядительный документ о полномочиях; для строк строительного контроля — идентификатор НРС, если членство в СРО требуется.</w:t>
       </w:r>
     </w:p>
     <w:p>
@@ -1182,7 +1187,7 @@
     </w:p>
     <w:p>
       <w:r>
-        <w:t>Наименование, марка, партия, количество, реквизиты документов о качестве и безопасности: [___]. При перечне более пяти документов — реестр № [___] от [___] как приложение.</w:t>
+        <w:t>Наименование, марка, партия, количество, реквизиты документов о качестве и безопасности: [___]. При перечне более пяти документов — реестр № [___] от [___], являющийся неотъемлемой частью акта.</w:t>
       </w:r>
     </w:p>
     <w:p>
@@ -1227,7 +1232,7 @@
     </w:p>
     <w:p>
       <w:r>
-        <w:t>Технический регламент, иной применимый акт с пунктами, раздел проекта / рабочей документации и критерий проверки: [___]. Результат освидетельствования, замечания и их устранение: [___].</w:t>
+        <w:t>Технический регламент, иной нормативный правовой акт со структурными единицами, раздел проекта / рабочей документации и критерий проверки: [___]. Результат освидетельствования, замечания и их устранение: [___].</w:t>
       </w:r>
     </w:p>
     <w:p>
@@ -1242,12 +1247,12 @@
     </w:p>
     <w:p>
       <w:r>
-        <w:t>□ Разрешаются последующие работы: точное наименование, конструкции или участки сетей [___]. □ Не разрешаются: причина и перечень замечаний [___]. Повторное освидетельствование, если требуется: [___].</w:t>
+        <w:t>Разрешаются последующие работы: точное наименование, конструкции или участки сетей [___]. При замечаниях оформите их устранение и повторное освидетельствование до подписания акта: документ № [___] от [___].</w:t>
       </w:r>
     </w:p>
     <w:p>
       <w:r>
-        <w:t>Дополнительные сведения [___]. Приложения с номерами и датами [___]. Акт на бумаге составлен в [___] экземплярах. Цена и срок дополнительных работ оформляются документами 11 и 12.</w:t>
+        <w:t>Дополнительные сведения, включая связь с объёмом по форме 02 № [___]: [___]. Приложения с номерами и датами [___]. Акт на бумаге составлен в [___] экземплярах.</w:t>
       </w:r>
     </w:p>
     <w:p>
@@ -1360,7 +1365,7 @@
                 <w:color w:val="262F37"/>
                 <w:sz w:val="18"/>
               </w:rPr>
-              <w:t>Контроль заказчика</w:t>
+              <w:t>Контроль застройщика / техзаказчика</w:t>
             </w:r>
           </w:p>
         </w:tc>
@@ -1425,7 +1430,7 @@
                 <w:color w:val="262F37"/>
                 <w:sz w:val="18"/>
               </w:rPr>
-              <w:t>Строительство</w:t>
+              <w:t>Лицо, осуществляющее строительство</w:t>
             </w:r>
           </w:p>
         </w:tc>
@@ -1490,7 +1495,7 @@
                 <w:color w:val="262F37"/>
                 <w:sz w:val="18"/>
               </w:rPr>
-              <w:t>Контроль строительства</w:t>
+              <w:t>Контроль лица, осуществляющего строительство</w:t>
             </w:r>
           </w:p>
         </w:tc>

</xml_diff>